<commit_message>
Align agents model and ethical extraction
</commit_message>
<xml_diff>
--- a/publication/modelo_cubridor_narrativo.docx
+++ b/publication/modelo_cubridor_narrativo.docx
@@ -26,7 +26,7 @@
           <w:i/>
           <w:sz w:val="21"/>
         </w:rPr>
-        <w:t>Sistema local para extracción, limpieza, validación humana, red compleja y solución multiobjetivo SCP</w:t>
+        <w:t>Sistema local para extracción, limpieza, validación humana, red compleja y selector nodal multiobjetivo inspirado en SCP</w:t>
       </w:r>
     </w:p>
     <w:p>
@@ -991,12 +991,12 @@
         <w:pStyle w:val="Heading1"/>
       </w:pPr>
       <w:r>
-        <w:t>5. Modelo SCP multiobjetivo</w:t>
+        <w:t>5. Selector nodal multiobjetivo inspirado en SCP</w:t>
       </w:r>
     </w:p>
     <w:p>
       <w:r>
-        <w:t>El universo no son los documentos sino las aristas objetivo A*. Cada nodo candidato v cubre/remueve sus aristas incidentes. El tercer objetivo mide daño estructural: una arista se cuenta como removida si toca al menos un nodo seleccionado.</w:t>
+        <w:t>El universo no son los documentos sino las aristas objetivo A*. El modelo se inspira en cobertura de conjuntos, pero no debe llamarse SCP clásico estricto mientras no se exija cobertura total del universo. El tercer objetivo mide daño estructural: una arista se cuenta como removida si toca al menos un nodo seleccionado.</w:t>
       </w:r>
     </w:p>
     <w:tbl>
@@ -1666,7 +1666,7 @@
     </w:p>
     <w:p>
       <w:r>
-        <w:t>Las soluciones se comparan por dominancia de Pareto. Los métodos se comparan con hipervolumen normalizado y con una superficie empírica u1 × u3 → u2 para no confundir una proyección 2D con el frente completo.</w:t>
+        <w:t>Las soluciones se comparan por dominancia de Pareto. Los métodos se comparan con hipervolumen normalizado aproximado y con una superficie empírica u1 × u3 → u2 para no confundir una proyección 2D con el frente completo.</w:t>
       </w:r>
     </w:p>
     <w:p>
@@ -2054,7 +2054,7 @@
     </w:tbl>
     <w:p>
       <w:r>
-        <w:t>Las métricas comunes son: hipervolumen normalizado, número de puntos no dominados globales, distancia generacional inversa (IGD) contra el frente global, spacing como uniformidad local y dispersión/extensión del frente en el espacio u1,u2,u3.</w:t>
+        <w:t>Las métricas comunes son: hipervolumen normalizado aproximado, número de puntos no dominados globales, distancia generacional inversa (IGD) contra el frente global, spacing como uniformidad local y dispersión/extensión del frente en el espacio u1,u2,u3.</w:t>
       </w:r>
     </w:p>
     <w:p>
@@ -2135,7 +2135,7 @@
         <w:pStyle w:val="ListBullet"/>
       </w:pPr>
       <w:r>
-        <w:t>N-gramas, redes semánticas, comunidades Louvain/alternativas locales y grafo de conocimiento.</w:t>
+        <w:t>N-gramas, redes semánticas, módulos semánticos Louvain/alternativas locales y grafo de conocimiento.</w:t>
       </w:r>
     </w:p>
     <w:p>
@@ -2151,7 +2151,7 @@
         <w:pStyle w:val="ListBullet"/>
       </w:pPr>
       <w:r>
-        <w:t>Frentes Pareto, hipervolumen, superficie empírica y comparación de métodos.</w:t>
+        <w:t>Frentes Pareto, hipervolumen aproximado, superficie empírica y comparación de métodos.</w:t>
       </w:r>
     </w:p>
     <w:p>

</xml_diff>